<commit_message>
replaced model covariate names
</commit_message>
<xml_diff>
--- a/reports/thesis/09_chapter_2.docx
+++ b/reports/thesis/09_chapter_2.docx
@@ -7624,9 +7624,9 @@
         <w:tblLook w:val="04A0" w:firstRow="1" w:lastRow="0" w:firstColumn="1" w:lastColumn="0" w:noHBand="0" w:noVBand="1"/>
       </w:tblPr>
       <w:tblGrid>
-        <w:gridCol w:w="1276"/>
+        <w:gridCol w:w="1219"/>
         <w:gridCol w:w="1329"/>
-        <w:gridCol w:w="6745"/>
+        <w:gridCol w:w="6802"/>
       </w:tblGrid>
       <w:tr>
         <w:tc>
@@ -7734,14 +7734,6 @@
               </w:rPr>
               <w:t>Visit</w:t>
             </w:r>
-            <w:r>
-              <w:rPr>
-                <w:rFonts w:ascii="Arial" w:hAnsi="Arial" w:cs="Arial"/>
-                <w:sz w:val="22"/>
-                <w:szCs w:val="22"/>
-              </w:rPr>
-              <w:t>*</w:t>
-            </w:r>
             <w:commentRangeEnd w:id="5"/>
             <w:r>
               <w:rPr>
@@ -7796,7 +7788,7 @@
                 <w:sz w:val="22"/>
                 <w:szCs w:val="22"/>
               </w:rPr>
-              <w:t>Using the map of available wolf kills, whether a raven had ≥1 GPS point within 500 m of a wolf kill inside their territory (Eq. 1) or outside their territory (Eq. 2) each day.</w:t>
+              <w:t>Using the map of available wolf kills, whether a raven had ≥1 GPS point within 500 m of a wolf kill inside their territory (Eq. 1) each day.</w:t>
             </w:r>
           </w:p>
         </w:tc>
@@ -7909,6 +7901,125 @@
                 <w:szCs w:val="22"/>
               </w:rPr>
               <w:lastRenderedPageBreak/>
+              <w:t>Kill</w:t>
+            </w:r>
+          </w:p>
+        </w:tc>
+        <w:tc>
+          <w:tcPr>
+            <w:tcW w:w="0" w:type="auto"/>
+          </w:tcPr>
+          <w:p>
+            <w:pPr>
+              <w:spacing w:line="480" w:lineRule="auto"/>
+              <w:rPr>
+                <w:rFonts w:ascii="Arial" w:hAnsi="Arial" w:cs="Arial"/>
+                <w:sz w:val="22"/>
+                <w:szCs w:val="22"/>
+              </w:rPr>
+            </w:pPr>
+            <w:r>
+              <w:rPr>
+                <w:rFonts w:ascii="Arial" w:hAnsi="Arial" w:cs="Arial"/>
+                <w:sz w:val="22"/>
+                <w:szCs w:val="22"/>
+              </w:rPr>
+              <w:t>Binary</w:t>
+            </w:r>
+          </w:p>
+        </w:tc>
+        <w:tc>
+          <w:tcPr>
+            <w:tcW w:w="0" w:type="auto"/>
+          </w:tcPr>
+          <w:p>
+            <w:pPr>
+              <w:spacing w:line="480" w:lineRule="auto"/>
+              <w:rPr>
+                <w:rFonts w:ascii="Arial" w:hAnsi="Arial" w:cs="Arial"/>
+                <w:sz w:val="22"/>
+                <w:szCs w:val="22"/>
+              </w:rPr>
+            </w:pPr>
+            <w:r>
+              <w:rPr>
+                <w:rFonts w:ascii="Arial" w:hAnsi="Arial" w:cs="Arial"/>
+                <w:sz w:val="22"/>
+                <w:szCs w:val="22"/>
+              </w:rPr>
+              <w:t xml:space="preserve">Using the map of available wolf kills, whether a raven had ≥1 GPS point within 500 m of a wolf kill </w:t>
+            </w:r>
+            <w:r>
+              <w:rPr>
+                <w:rFonts w:ascii="Arial" w:hAnsi="Arial" w:cs="Arial"/>
+                <w:sz w:val="22"/>
+                <w:szCs w:val="22"/>
+              </w:rPr>
+              <w:t>outside</w:t>
+            </w:r>
+            <w:r>
+              <w:rPr>
+                <w:rFonts w:ascii="Arial" w:hAnsi="Arial" w:cs="Arial"/>
+                <w:sz w:val="22"/>
+                <w:szCs w:val="22"/>
+              </w:rPr>
+              <w:t xml:space="preserve"> their territory (Eq. </w:t>
+            </w:r>
+            <w:r>
+              <w:rPr>
+                <w:rFonts w:ascii="Arial" w:hAnsi="Arial" w:cs="Arial"/>
+                <w:sz w:val="22"/>
+                <w:szCs w:val="22"/>
+              </w:rPr>
+              <w:t>2</w:t>
+            </w:r>
+            <w:r>
+              <w:rPr>
+                <w:rFonts w:ascii="Arial" w:hAnsi="Arial" w:cs="Arial"/>
+                <w:sz w:val="22"/>
+                <w:szCs w:val="22"/>
+              </w:rPr>
+              <w:t>)</w:t>
+            </w:r>
+            <w:r>
+              <w:rPr>
+                <w:rFonts w:ascii="Arial" w:hAnsi="Arial" w:cs="Arial"/>
+                <w:sz w:val="22"/>
+                <w:szCs w:val="22"/>
+              </w:rPr>
+              <w:t xml:space="preserve"> </w:t>
+            </w:r>
+            <w:r>
+              <w:rPr>
+                <w:rFonts w:ascii="Arial" w:hAnsi="Arial" w:cs="Arial"/>
+                <w:sz w:val="22"/>
+                <w:szCs w:val="22"/>
+              </w:rPr>
+              <w:t>each day.</w:t>
+            </w:r>
+          </w:p>
+        </w:tc>
+      </w:tr>
+      <w:tr>
+        <w:tc>
+          <w:tcPr>
+            <w:tcW w:w="0" w:type="auto"/>
+          </w:tcPr>
+          <w:p>
+            <w:pPr>
+              <w:spacing w:line="480" w:lineRule="auto"/>
+              <w:rPr>
+                <w:rFonts w:ascii="Arial" w:hAnsi="Arial" w:cs="Arial"/>
+                <w:sz w:val="22"/>
+                <w:szCs w:val="22"/>
+              </w:rPr>
+            </w:pPr>
+            <w:r>
+              <w:rPr>
+                <w:rFonts w:ascii="Arial" w:hAnsi="Arial" w:cs="Arial"/>
+                <w:sz w:val="22"/>
+                <w:szCs w:val="22"/>
+              </w:rPr>
               <w:t>Biomass</w:t>
             </w:r>
           </w:p>
@@ -8026,39 +8137,7 @@
                 <w:sz w:val="22"/>
                 <w:szCs w:val="22"/>
               </w:rPr>
-              <w:t xml:space="preserve">Whether each day was </w:t>
-            </w:r>
-            <w:r>
-              <w:rPr>
-                <w:rFonts w:ascii="Arial" w:hAnsi="Arial" w:cs="Arial"/>
-                <w:sz w:val="22"/>
-                <w:szCs w:val="22"/>
-              </w:rPr>
-              <w:t xml:space="preserve">within the </w:t>
-            </w:r>
-            <w:r>
-              <w:rPr>
-                <w:rFonts w:ascii="Arial" w:hAnsi="Arial" w:cs="Arial"/>
-                <w:sz w:val="22"/>
-                <w:szCs w:val="22"/>
-              </w:rPr>
-              <w:t xml:space="preserve">time </w:t>
-            </w:r>
-            <w:r>
-              <w:rPr>
-                <w:rFonts w:ascii="Arial" w:hAnsi="Arial" w:cs="Arial"/>
-                <w:sz w:val="22"/>
-                <w:szCs w:val="22"/>
-              </w:rPr>
-              <w:t>window of MTFWP or bison recreational hunting</w:t>
-            </w:r>
-            <w:r>
-              <w:rPr>
-                <w:rFonts w:ascii="Arial" w:hAnsi="Arial" w:cs="Arial"/>
-                <w:sz w:val="22"/>
-                <w:szCs w:val="22"/>
-              </w:rPr>
-              <w:t>.</w:t>
+              <w:t>Whether each day was within the time window of MTFWP or bison recreational hunting.</w:t>
             </w:r>
           </w:p>
         </w:tc>
@@ -9050,7 +9129,16 @@
           <w:sz w:val="22"/>
           <w:szCs w:val="22"/>
         </w:rPr>
-        <w:t xml:space="preserve"> to forage in West Yellowstone, MT (Fig. </w:t>
+        <w:t xml:space="preserve"> to forage in </w:t>
+      </w:r>
+      <w:r>
+        <w:rPr>
+          <w:rFonts w:ascii="Arial" w:hAnsi="Arial" w:cs="Arial"/>
+          <w:sz w:val="22"/>
+          <w:szCs w:val="22"/>
+        </w:rPr>
+        <w:lastRenderedPageBreak/>
+        <w:t xml:space="preserve">West Yellowstone, MT (Fig. </w:t>
       </w:r>
       <w:r>
         <w:rPr>
@@ -9197,7 +9285,6 @@
           <w:sz w:val="22"/>
           <w:szCs w:val="22"/>
         </w:rPr>
-        <w:lastRenderedPageBreak/>
         <w:drawing>
           <wp:inline distT="0" distB="0" distL="0" distR="0" wp14:anchorId="4FD70A3F" wp14:editId="5342A2ED">
             <wp:extent cx="5937885" cy="4542790"/>
@@ -9525,7 +9612,6 @@
           <w:sz w:val="22"/>
           <w:szCs w:val="22"/>
         </w:rPr>
-        <w:lastRenderedPageBreak/>
         <w:drawing>
           <wp:inline distT="0" distB="0" distL="0" distR="0" wp14:anchorId="6BF61E1C" wp14:editId="2C9B66D8">
             <wp:extent cx="5937250" cy="4667250"/>
@@ -9789,7 +9875,16 @@
           <w:sz w:val="22"/>
           <w:szCs w:val="22"/>
         </w:rPr>
-        <w:t>The proportion of days ravens left their territories to visit sites other than the hunting region</w:t>
+        <w:t xml:space="preserve">The proportion of days ravens left their </w:t>
+      </w:r>
+      <w:r>
+        <w:rPr>
+          <w:rFonts w:ascii="Arial" w:hAnsi="Arial" w:cs="Arial"/>
+          <w:sz w:val="22"/>
+          <w:szCs w:val="22"/>
+        </w:rPr>
+        <w:lastRenderedPageBreak/>
+        <w:t>territories to visit sites other than the hunting region</w:t>
       </w:r>
       <w:r>
         <w:rPr>
@@ -9829,16 +9924,7 @@
           <w:sz w:val="22"/>
           <w:szCs w:val="22"/>
         </w:rPr>
-        <w:t xml:space="preserve">Before hunting began in late October and between hunting seasons in the middle of </w:t>
-      </w:r>
-      <w:r>
-        <w:rPr>
-          <w:rFonts w:ascii="Arial" w:hAnsi="Arial" w:cs="Arial"/>
-          <w:sz w:val="22"/>
-          <w:szCs w:val="22"/>
-        </w:rPr>
-        <w:lastRenderedPageBreak/>
-        <w:t>winter, ravens visiting the hunting regions spent more time at the Gardiner landfill and sewage treatment ponds</w:t>
+        <w:t>Before hunting began in late October and between hunting seasons in the middle of winter, ravens visiting the hunting regions spent more time at the Gardiner landfill and sewage treatment ponds</w:t>
       </w:r>
       <w:r>
         <w:rPr>
@@ -12190,10 +12276,10 @@
         </w:rPr>
         <w:lastRenderedPageBreak/>
         <w:drawing>
-          <wp:inline distT="0" distB="0" distL="0" distR="0" wp14:anchorId="08CB6821" wp14:editId="34F46397">
+          <wp:inline distT="0" distB="0" distL="0" distR="0" wp14:anchorId="5D64F72A" wp14:editId="0DCF5084">
             <wp:extent cx="5937250" cy="4540250"/>
             <wp:effectExtent l="0" t="0" r="6350" b="0"/>
-            <wp:docPr id="1309768767" name="Picture 2"/>
+            <wp:docPr id="2023350274" name="Picture 1"/>
             <wp:cNvGraphicFramePr>
               <a:graphicFrameLocks xmlns:a="http://schemas.openxmlformats.org/drawingml/2006/main" noChangeAspect="1"/>
             </wp:cNvGraphicFramePr>
@@ -12201,7 +12287,7 @@
               <a:graphicData uri="http://schemas.openxmlformats.org/drawingml/2006/picture">
                 <pic:pic xmlns:pic="http://schemas.openxmlformats.org/drawingml/2006/picture">
                   <pic:nvPicPr>
-                    <pic:cNvPr id="0" name="Picture 2"/>
+                    <pic:cNvPr id="0" name="Picture 1"/>
                     <pic:cNvPicPr>
                       <a:picLocks noChangeAspect="1" noChangeArrowheads="1"/>
                     </pic:cNvPicPr>

</xml_diff>